<commit_message>
Updated database ER diagram according to comments
</commit_message>
<xml_diff>
--- a/PersonalFinanceManager/Assignment_PersonalFinanceManager.docx
+++ b/PersonalFinanceManager/Assignment_PersonalFinanceManager.docx
@@ -413,7 +413,7 @@
       </w:pPr>
       <w:r>
         <w:drawing>
-          <wp:inline xmlns:wp14="http://schemas.microsoft.com/office/word/2010/wordprocessingDrawing" wp14:editId="45D3EBE5" wp14:anchorId="60BB80D0">
+          <wp:inline xmlns:wp14="http://schemas.microsoft.com/office/word/2010/wordprocessingDrawing" wp14:editId="566C4182" wp14:anchorId="60BB80D0">
             <wp:extent cx="5943600" cy="1228725"/>
             <wp:effectExtent l="0" t="0" r="0" b="0"/>
             <wp:docPr id="1160763140" name="drawing"/>
@@ -892,7 +892,7 @@
       </w:pPr>
       <w:r>
         <w:drawing>
-          <wp:inline xmlns:wp14="http://schemas.microsoft.com/office/word/2010/wordprocessingDrawing" wp14:editId="1BDF6EF6" wp14:anchorId="5EE77D57">
+          <wp:inline xmlns:wp14="http://schemas.microsoft.com/office/word/2010/wordprocessingDrawing" wp14:editId="1D297C23" wp14:anchorId="5EE77D57">
             <wp:extent cx="4858428" cy="3181794"/>
             <wp:effectExtent l="0" t="0" r="0" b="0"/>
             <wp:docPr id="1809532975" name="drawing"/>
@@ -1402,17 +1402,17 @@
         <w:t>A relational database is used to store structured financial data with clearly defined relationships.</w:t>
       </w:r>
     </w:p>
-    <w:p xmlns:wp14="http://schemas.microsoft.com/office/word/2010/wordml" wp14:paraId="7596275B" wp14:textId="50848EF2">
+    <w:p xmlns:wp14="http://schemas.microsoft.com/office/word/2010/wordml" wp14:paraId="7596275B" wp14:textId="11D06A89">
       <w:pPr>
         <w:pStyle w:val="Normal"/>
         <w:spacing w:before="0" w:beforeAutospacing="off" w:after="0" w:afterAutospacing="off"/>
       </w:pPr>
       <w:r>
         <w:drawing>
-          <wp:inline xmlns:wp14="http://schemas.microsoft.com/office/word/2010/wordprocessingDrawing" wp14:editId="031E0101" wp14:anchorId="6B488EFE">
-            <wp:extent cx="3553321" cy="3391373"/>
+          <wp:inline xmlns:wp14="http://schemas.microsoft.com/office/word/2010/wordprocessingDrawing" wp14:editId="7C364C83" wp14:anchorId="5420C938">
+            <wp:extent cx="5363323" cy="3067478"/>
             <wp:effectExtent l="0" t="0" r="0" b="0"/>
-            <wp:docPr id="1539869776" name="drawing"/>
+            <wp:docPr id="89524325" name="drawing"/>
             <wp:cNvGraphicFramePr>
               <a:graphicFrameLocks noChangeAspect="1"/>
             </wp:cNvGraphicFramePr>
@@ -1420,11 +1420,11 @@
               <a:graphicData xmlns:a="http://schemas.openxmlformats.org/drawingml/2006/main" uri="http://schemas.openxmlformats.org/drawingml/2006/picture">
                 <pic:pic xmlns:pic="http://schemas.openxmlformats.org/drawingml/2006/picture">
                   <pic:nvPicPr>
-                    <pic:cNvPr id="1539869776" name="Picture 1539869776"/>
+                    <pic:cNvPr id="89524325" name="Picture 89524325"/>
                     <pic:cNvPicPr/>
                   </pic:nvPicPr>
                   <pic:blipFill>
-                    <a:blip xmlns:r="http://schemas.openxmlformats.org/officeDocument/2006/relationships" r:embed="rId1409314039">
+                    <a:blip xmlns:r="http://schemas.openxmlformats.org/officeDocument/2006/relationships" r:embed="rId107618269">
                       <a:extLst>
                         <a:ext uri="{28A0092B-C50C-407E-A947-70E740481C1C}">
                           <a14:useLocalDpi xmlns:a14="http://schemas.microsoft.com/office/drawing/2010/main"/>
@@ -1438,7 +1438,7 @@
                   <pic:spPr>
                     <a:xfrm>
                       <a:off x="0" y="0"/>
-                      <a:ext cx="3553321" cy="3391373"/>
+                      <a:ext cx="5363323" cy="3067478"/>
                     </a:xfrm>
                     <a:prstGeom prst="rect">
                       <a:avLst/>
@@ -1493,7 +1493,7 @@
         <w:t>Expenses Table</w:t>
       </w:r>
     </w:p>
-    <w:p xmlns:wp14="http://schemas.microsoft.com/office/word/2010/wordml" wp14:paraId="2FE687EF" wp14:textId="72D705A8">
+    <w:p xmlns:wp14="http://schemas.microsoft.com/office/word/2010/wordml" wp14:paraId="55842209" wp14:textId="4EDD2C07">
       <w:pPr>
         <w:pStyle w:val="Normal"/>
         <w:spacing w:before="0" w:beforeAutospacing="off" w:after="0" w:afterAutospacing="off"/>
@@ -1503,7 +1503,7 @@
         <w:t>CREATE TABLE expenses (</w:t>
       </w:r>
     </w:p>
-    <w:p xmlns:wp14="http://schemas.microsoft.com/office/word/2010/wordml" wp14:paraId="42BF2A76" wp14:textId="4E952DF6">
+    <w:p xmlns:wp14="http://schemas.microsoft.com/office/word/2010/wordml" wp14:paraId="4C2E971C" wp14:textId="249352D6">
       <w:pPr>
         <w:pStyle w:val="Normal"/>
         <w:spacing w:before="0" w:beforeAutospacing="off" w:after="0" w:afterAutospacing="off"/>
@@ -1513,47 +1513,107 @@
         <w:t xml:space="preserve">  id INT AUTO_INCREMENT PRIMARY KEY,</w:t>
       </w:r>
     </w:p>
-    <w:p xmlns:wp14="http://schemas.microsoft.com/office/word/2010/wordml" wp14:paraId="4B3EE3A0" wp14:textId="48D1844C">
+    <w:p xmlns:wp14="http://schemas.microsoft.com/office/word/2010/wordml" wp14:paraId="0AE4C468" wp14:textId="769D5305">
       <w:pPr>
         <w:pStyle w:val="Normal"/>
         <w:spacing w:before="0" w:beforeAutospacing="off" w:after="0" w:afterAutospacing="off"/>
       </w:pPr>
       <w:r>
         <w:rPr/>
-        <w:t xml:space="preserve">  amount DECIMAL(10,2),</w:t>
-      </w:r>
-    </w:p>
-    <w:p xmlns:wp14="http://schemas.microsoft.com/office/word/2010/wordml" wp14:paraId="40916E45" wp14:textId="733C2F31">
+        <w:t xml:space="preserve">  amount DECIMAL(10,2) NOT NULL,</w:t>
+      </w:r>
+    </w:p>
+    <w:p xmlns:wp14="http://schemas.microsoft.com/office/word/2010/wordml" wp14:paraId="41F67F99" wp14:textId="18E98F7A">
       <w:pPr>
         <w:pStyle w:val="Normal"/>
         <w:spacing w:before="0" w:beforeAutospacing="off" w:after="0" w:afterAutospacing="off"/>
       </w:pPr>
       <w:r>
         <w:rPr/>
-        <w:t xml:space="preserve">  category VARCHAR(50),</w:t>
-      </w:r>
-    </w:p>
-    <w:p xmlns:wp14="http://schemas.microsoft.com/office/word/2010/wordml" wp14:paraId="465F8687" wp14:textId="5F1B7B3D">
+        <w:t xml:space="preserve">  category_id INT NOT NULL,</w:t>
+      </w:r>
+    </w:p>
+    <w:p xmlns:wp14="http://schemas.microsoft.com/office/word/2010/wordml" wp14:paraId="4FACDE12" wp14:textId="63AB5E79">
       <w:pPr>
         <w:pStyle w:val="Normal"/>
         <w:spacing w:before="0" w:beforeAutospacing="off" w:after="0" w:afterAutospacing="off"/>
       </w:pPr>
       <w:r>
         <w:rPr/>
-        <w:t xml:space="preserve">  date DATE,</w:t>
-      </w:r>
-    </w:p>
-    <w:p xmlns:wp14="http://schemas.microsoft.com/office/word/2010/wordml" wp14:paraId="237882D1" wp14:textId="3A7A525B">
+        <w:t xml:space="preserve">  date DATE NOT NULL,</w:t>
+      </w:r>
+    </w:p>
+    <w:p xmlns:wp14="http://schemas.microsoft.com/office/word/2010/wordml" wp14:paraId="5A47DDB6" wp14:textId="23EEA09C">
       <w:pPr>
         <w:pStyle w:val="Normal"/>
         <w:spacing w:before="0" w:beforeAutospacing="off" w:after="0" w:afterAutospacing="off"/>
       </w:pPr>
       <w:r>
         <w:rPr/>
-        <w:t xml:space="preserve">  description TEXT</w:t>
-      </w:r>
-    </w:p>
-    <w:p xmlns:wp14="http://schemas.microsoft.com/office/word/2010/wordml" wp14:paraId="2F5910EF" wp14:textId="712BD684">
+        <w:t xml:space="preserve">  description TEXT,</w:t>
+      </w:r>
+    </w:p>
+    <w:p xmlns:wp14="http://schemas.microsoft.com/office/word/2010/wordml" wp14:paraId="7ECCEA6A" wp14:textId="0C81775E">
+      <w:pPr>
+        <w:pStyle w:val="Normal"/>
+        <w:spacing w:before="0" w:beforeAutospacing="off" w:after="0" w:afterAutospacing="off"/>
+      </w:pPr>
+      <w:r>
+        <w:rPr/>
+        <w:t xml:space="preserve"> </w:t>
+      </w:r>
+    </w:p>
+    <w:p xmlns:wp14="http://schemas.microsoft.com/office/word/2010/wordml" wp14:paraId="4BFCB88B" wp14:textId="2CB36E58">
+      <w:pPr>
+        <w:pStyle w:val="Normal"/>
+        <w:spacing w:before="0" w:beforeAutospacing="off" w:after="0" w:afterAutospacing="off"/>
+      </w:pPr>
+      <w:r>
+        <w:rPr/>
+        <w:t xml:space="preserve">  CONSTRAINT fk_expense_category</w:t>
+      </w:r>
+    </w:p>
+    <w:p xmlns:wp14="http://schemas.microsoft.com/office/word/2010/wordml" wp14:paraId="4DCB3800" wp14:textId="5ED53D79">
+      <w:pPr>
+        <w:pStyle w:val="Normal"/>
+        <w:spacing w:before="0" w:beforeAutospacing="off" w:after="0" w:afterAutospacing="off"/>
+      </w:pPr>
+      <w:r>
+        <w:rPr/>
+        <w:t xml:space="preserve">    FOREIGN KEY (category_id)</w:t>
+      </w:r>
+    </w:p>
+    <w:p xmlns:wp14="http://schemas.microsoft.com/office/word/2010/wordml" wp14:paraId="5FFDF9B0" wp14:textId="6A7D455D">
+      <w:pPr>
+        <w:pStyle w:val="Normal"/>
+        <w:spacing w:before="0" w:beforeAutospacing="off" w:after="0" w:afterAutospacing="off"/>
+      </w:pPr>
+      <w:r>
+        <w:rPr/>
+        <w:t xml:space="preserve">    REFERENCES categories(id)</w:t>
+      </w:r>
+    </w:p>
+    <w:p xmlns:wp14="http://schemas.microsoft.com/office/word/2010/wordml" wp14:paraId="6AAB0997" wp14:textId="10DFE78F">
+      <w:pPr>
+        <w:pStyle w:val="Normal"/>
+        <w:spacing w:before="0" w:beforeAutospacing="off" w:after="0" w:afterAutospacing="off"/>
+      </w:pPr>
+      <w:r>
+        <w:rPr/>
+        <w:t xml:space="preserve">    ON DELETE RESTRICT</w:t>
+      </w:r>
+    </w:p>
+    <w:p xmlns:wp14="http://schemas.microsoft.com/office/word/2010/wordml" wp14:paraId="25067E9A" wp14:textId="50E13586">
+      <w:pPr>
+        <w:pStyle w:val="Normal"/>
+        <w:spacing w:before="0" w:beforeAutospacing="off" w:after="0" w:afterAutospacing="off"/>
+      </w:pPr>
+      <w:r>
+        <w:rPr/>
+        <w:t xml:space="preserve">    ON UPDATE CASCADE</w:t>
+      </w:r>
+    </w:p>
+    <w:p xmlns:wp14="http://schemas.microsoft.com/office/word/2010/wordml" wp14:paraId="1C529AD0" wp14:textId="44096F84">
       <w:pPr>
         <w:pStyle w:val="Normal"/>
         <w:spacing w:before="0" w:beforeAutospacing="off" w:after="0" w:afterAutospacing="off"/>
@@ -1585,10 +1645,9 @@
         <w:t>Income Table</w:t>
       </w:r>
     </w:p>
-    <w:p xmlns:wp14="http://schemas.microsoft.com/office/word/2010/wordml" wp14:paraId="69E56985" wp14:textId="261A9405">
-      <w:pPr>
-        <w:pStyle w:val="Normal"/>
-        <w:bidi w:val="0"/>
+    <w:p xmlns:wp14="http://schemas.microsoft.com/office/word/2010/wordml" wp14:paraId="24EC6F58" wp14:textId="1C0E3634">
+      <w:pPr>
+        <w:pStyle w:val="Normal"/>
       </w:pPr>
       <w:r>
         <w:rPr>
@@ -1598,7 +1657,7 @@
         <w:t>CREATE TABLE income (</w:t>
       </w:r>
     </w:p>
-    <w:p xmlns:wp14="http://schemas.microsoft.com/office/word/2010/wordml" wp14:paraId="34FDAABF" wp14:textId="77CD9AC8">
+    <w:p xmlns:wp14="http://schemas.microsoft.com/office/word/2010/wordml" wp14:paraId="0B183D97" wp14:textId="18E81437">
       <w:pPr>
         <w:pStyle w:val="Normal"/>
       </w:pPr>
@@ -1610,19 +1669,19 @@
         <w:t xml:space="preserve">  id INT AUTO_INCREMENT PRIMARY KEY,</w:t>
       </w:r>
     </w:p>
-    <w:p xmlns:wp14="http://schemas.microsoft.com/office/word/2010/wordml" wp14:paraId="028D7319" wp14:textId="485A9DE3">
-      <w:pPr>
-        <w:pStyle w:val="Normal"/>
-      </w:pPr>
-      <w:r>
-        <w:rPr>
-          <w:noProof w:val="0"/>
-          <w:lang w:val="en-US"/>
-        </w:rPr>
-        <w:t xml:space="preserve">  amount DECIMAL(10,2),</w:t>
-      </w:r>
-    </w:p>
-    <w:p xmlns:wp14="http://schemas.microsoft.com/office/word/2010/wordml" wp14:paraId="1ADC232C" wp14:textId="59E9338D">
+    <w:p xmlns:wp14="http://schemas.microsoft.com/office/word/2010/wordml" wp14:paraId="4D0B84AC" wp14:textId="2FDAE9DA">
+      <w:pPr>
+        <w:pStyle w:val="Normal"/>
+      </w:pPr>
+      <w:r>
+        <w:rPr>
+          <w:noProof w:val="0"/>
+          <w:lang w:val="en-US"/>
+        </w:rPr>
+        <w:t xml:space="preserve">  amount DECIMAL(10,2) NOT NULL,</w:t>
+      </w:r>
+    </w:p>
+    <w:p xmlns:wp14="http://schemas.microsoft.com/office/word/2010/wordml" wp14:paraId="3AE89209" wp14:textId="1116B5DE">
       <w:pPr>
         <w:pStyle w:val="Normal"/>
       </w:pPr>
@@ -1634,19 +1693,103 @@
         <w:t xml:space="preserve">  source VARCHAR(50),</w:t>
       </w:r>
     </w:p>
-    <w:p xmlns:wp14="http://schemas.microsoft.com/office/word/2010/wordml" wp14:paraId="0C44EC18" wp14:textId="7FE75CC1">
-      <w:pPr>
-        <w:pStyle w:val="Normal"/>
-      </w:pPr>
-      <w:r>
-        <w:rPr>
-          <w:noProof w:val="0"/>
-          <w:lang w:val="en-US"/>
-        </w:rPr>
-        <w:t xml:space="preserve">  date DATE</w:t>
-      </w:r>
-    </w:p>
-    <w:p xmlns:wp14="http://schemas.microsoft.com/office/word/2010/wordml" wp14:paraId="022109FD" wp14:textId="7E75AF91">
+    <w:p xmlns:wp14="http://schemas.microsoft.com/office/word/2010/wordml" wp14:paraId="040CFBEE" wp14:textId="0556CD67">
+      <w:pPr>
+        <w:pStyle w:val="Normal"/>
+      </w:pPr>
+      <w:r>
+        <w:rPr>
+          <w:noProof w:val="0"/>
+          <w:lang w:val="en-US"/>
+        </w:rPr>
+        <w:t xml:space="preserve">  category_id INT,</w:t>
+      </w:r>
+    </w:p>
+    <w:p xmlns:wp14="http://schemas.microsoft.com/office/word/2010/wordml" wp14:paraId="2E4A84DE" wp14:textId="4F04F455">
+      <w:pPr>
+        <w:pStyle w:val="Normal"/>
+      </w:pPr>
+      <w:r>
+        <w:rPr>
+          <w:noProof w:val="0"/>
+          <w:lang w:val="en-US"/>
+        </w:rPr>
+        <w:t xml:space="preserve">  date DATE NOT NULL,</w:t>
+      </w:r>
+    </w:p>
+    <w:p xmlns:wp14="http://schemas.microsoft.com/office/word/2010/wordml" wp14:paraId="437611BE" wp14:textId="75F35D86">
+      <w:pPr>
+        <w:pStyle w:val="Normal"/>
+      </w:pPr>
+      <w:r>
+        <w:rPr>
+          <w:noProof w:val="0"/>
+          <w:lang w:val="en-US"/>
+        </w:rPr>
+        <w:t xml:space="preserve"> </w:t>
+      </w:r>
+    </w:p>
+    <w:p xmlns:wp14="http://schemas.microsoft.com/office/word/2010/wordml" wp14:paraId="4E9849E8" wp14:textId="5F9414EE">
+      <w:pPr>
+        <w:pStyle w:val="Normal"/>
+      </w:pPr>
+      <w:r>
+        <w:rPr>
+          <w:noProof w:val="0"/>
+          <w:lang w:val="en-US"/>
+        </w:rPr>
+        <w:t xml:space="preserve">  CONSTRAINT fk_income_category</w:t>
+      </w:r>
+    </w:p>
+    <w:p xmlns:wp14="http://schemas.microsoft.com/office/word/2010/wordml" wp14:paraId="5A3A5B19" wp14:textId="581D2BDE">
+      <w:pPr>
+        <w:pStyle w:val="Normal"/>
+      </w:pPr>
+      <w:r>
+        <w:rPr>
+          <w:noProof w:val="0"/>
+          <w:lang w:val="en-US"/>
+        </w:rPr>
+        <w:t xml:space="preserve">    FOREIGN KEY (category_id)</w:t>
+      </w:r>
+    </w:p>
+    <w:p xmlns:wp14="http://schemas.microsoft.com/office/word/2010/wordml" wp14:paraId="18C2B636" wp14:textId="3EBCA2D0">
+      <w:pPr>
+        <w:pStyle w:val="Normal"/>
+      </w:pPr>
+      <w:r>
+        <w:rPr>
+          <w:noProof w:val="0"/>
+          <w:lang w:val="en-US"/>
+        </w:rPr>
+        <w:t xml:space="preserve">    REFERENCES categories(id)</w:t>
+      </w:r>
+    </w:p>
+    <w:p xmlns:wp14="http://schemas.microsoft.com/office/word/2010/wordml" wp14:paraId="0FB0DC44" wp14:textId="64C2A5B2">
+      <w:pPr>
+        <w:pStyle w:val="Normal"/>
+      </w:pPr>
+      <w:r>
+        <w:rPr>
+          <w:noProof w:val="0"/>
+          <w:lang w:val="en-US"/>
+        </w:rPr>
+        <w:t xml:space="preserve">    ON DELETE SET NULL</w:t>
+      </w:r>
+    </w:p>
+    <w:p xmlns:wp14="http://schemas.microsoft.com/office/word/2010/wordml" wp14:paraId="14FB1C71" wp14:textId="1E30215F">
+      <w:pPr>
+        <w:pStyle w:val="Normal"/>
+      </w:pPr>
+      <w:r>
+        <w:rPr>
+          <w:noProof w:val="0"/>
+          <w:lang w:val="en-US"/>
+        </w:rPr>
+        <w:t xml:space="preserve">    ON UPDATE CASCADE</w:t>
+      </w:r>
+    </w:p>
+    <w:p xmlns:wp14="http://schemas.microsoft.com/office/word/2010/wordml" wp14:paraId="6126EFD8" wp14:textId="49357481">
       <w:pPr>
         <w:pStyle w:val="Normal"/>
       </w:pPr>
@@ -1657,12 +1800,6 @@
         </w:rPr>
         <w:t>);</w:t>
       </w:r>
-    </w:p>
-    <w:p xmlns:wp14="http://schemas.microsoft.com/office/word/2010/wordml" wp14:paraId="6126EFD8" wp14:textId="38B168BB">
-      <w:pPr>
-        <w:pStyle w:val="Normal"/>
-        <w:spacing w:before="0" w:beforeAutospacing="off" w:after="0" w:afterAutospacing="off"/>
-      </w:pPr>
     </w:p>
     <w:p xmlns:wp14="http://schemas.microsoft.com/office/word/2010/wordml" wp14:paraId="4C36658F" wp14:textId="3543E44F">
       <w:pPr>
@@ -1686,7 +1823,7 @@
         <w:t>Budgets Table</w:t>
       </w:r>
     </w:p>
-    <w:p xmlns:wp14="http://schemas.microsoft.com/office/word/2010/wordml" wp14:paraId="23D53502" wp14:textId="51AC86C4">
+    <w:p xmlns:wp14="http://schemas.microsoft.com/office/word/2010/wordml" wp14:paraId="21CF747D" wp14:textId="0B3C1940">
       <w:pPr>
         <w:pStyle w:val="Normal"/>
         <w:spacing w:before="0" w:beforeAutospacing="off" w:after="0" w:afterAutospacing="off"/>
@@ -1702,7 +1839,7 @@
         <w:t>CREATE TABLE budgets (</w:t>
       </w:r>
     </w:p>
-    <w:p xmlns:wp14="http://schemas.microsoft.com/office/word/2010/wordml" wp14:paraId="78EC82F3" wp14:textId="15911A8D">
+    <w:p xmlns:wp14="http://schemas.microsoft.com/office/word/2010/wordml" wp14:paraId="5D618EBA" wp14:textId="75C109E8">
       <w:pPr>
         <w:pStyle w:val="Normal"/>
         <w:spacing w:before="0" w:beforeAutospacing="off" w:after="0" w:afterAutospacing="off"/>
@@ -1718,39 +1855,221 @@
         <w:t xml:space="preserve">  id INT AUTO_INCREMENT PRIMARY KEY,</w:t>
       </w:r>
     </w:p>
-    <w:p xmlns:wp14="http://schemas.microsoft.com/office/word/2010/wordml" wp14:paraId="1E76BA2C" wp14:textId="3419F088">
-      <w:pPr>
-        <w:pStyle w:val="Normal"/>
-        <w:spacing w:before="0" w:beforeAutospacing="off" w:after="0" w:afterAutospacing="off"/>
-      </w:pPr>
-      <w:r>
-        <w:rPr>
-          <w:rFonts w:ascii="Calibri" w:hAnsi="Calibri" w:eastAsia="Calibri" w:cs="Calibri"/>
-          <w:noProof w:val="0"/>
-          <w:sz w:val="24"/>
-          <w:szCs w:val="24"/>
-          <w:lang w:val="en-US"/>
-        </w:rPr>
-        <w:t xml:space="preserve">  category VARCHAR(50),</w:t>
-      </w:r>
-    </w:p>
-    <w:p xmlns:wp14="http://schemas.microsoft.com/office/word/2010/wordml" wp14:paraId="23627122" wp14:textId="6A039138">
-      <w:pPr>
-        <w:pStyle w:val="Normal"/>
-        <w:spacing w:before="0" w:beforeAutospacing="off" w:after="0" w:afterAutospacing="off"/>
-      </w:pPr>
-      <w:r>
-        <w:rPr>
-          <w:rFonts w:ascii="Calibri" w:hAnsi="Calibri" w:eastAsia="Calibri" w:cs="Calibri"/>
-          <w:noProof w:val="0"/>
-          <w:sz w:val="24"/>
-          <w:szCs w:val="24"/>
-          <w:lang w:val="en-US"/>
-        </w:rPr>
-        <w:t xml:space="preserve">  limit_amount DECIMAL(10,2)</w:t>
-      </w:r>
-    </w:p>
-    <w:p xmlns:wp14="http://schemas.microsoft.com/office/word/2010/wordml" wp14:paraId="160395D2" wp14:textId="7B9F2D91">
+    <w:p xmlns:wp14="http://schemas.microsoft.com/office/word/2010/wordml" wp14:paraId="6E27171F" wp14:textId="0EDE0E07">
+      <w:pPr>
+        <w:pStyle w:val="Normal"/>
+        <w:spacing w:before="0" w:beforeAutospacing="off" w:after="0" w:afterAutospacing="off"/>
+      </w:pPr>
+      <w:r>
+        <w:rPr>
+          <w:rFonts w:ascii="Calibri" w:hAnsi="Calibri" w:eastAsia="Calibri" w:cs="Calibri"/>
+          <w:noProof w:val="0"/>
+          <w:sz w:val="24"/>
+          <w:szCs w:val="24"/>
+          <w:lang w:val="en-US"/>
+        </w:rPr>
+        <w:t xml:space="preserve">  category_id INT NOT NULL,</w:t>
+      </w:r>
+    </w:p>
+    <w:p xmlns:wp14="http://schemas.microsoft.com/office/word/2010/wordml" wp14:paraId="4591A89D" wp14:textId="5D43B850">
+      <w:pPr>
+        <w:pStyle w:val="Normal"/>
+        <w:spacing w:before="0" w:beforeAutospacing="off" w:after="0" w:afterAutospacing="off"/>
+      </w:pPr>
+      <w:r>
+        <w:rPr>
+          <w:rFonts w:ascii="Calibri" w:hAnsi="Calibri" w:eastAsia="Calibri" w:cs="Calibri"/>
+          <w:noProof w:val="0"/>
+          <w:sz w:val="24"/>
+          <w:szCs w:val="24"/>
+          <w:lang w:val="en-US"/>
+        </w:rPr>
+        <w:t xml:space="preserve">  limit_amount DECIMAL(10,2) NOT NULL,</w:t>
+      </w:r>
+    </w:p>
+    <w:p xmlns:wp14="http://schemas.microsoft.com/office/word/2010/wordml" wp14:paraId="7B5FCC7E" wp14:textId="0DF442D1">
+      <w:pPr>
+        <w:pStyle w:val="Normal"/>
+        <w:spacing w:before="0" w:beforeAutospacing="off" w:after="0" w:afterAutospacing="off"/>
+      </w:pPr>
+      <w:r>
+        <w:rPr>
+          <w:rFonts w:ascii="Calibri" w:hAnsi="Calibri" w:eastAsia="Calibri" w:cs="Calibri"/>
+          <w:noProof w:val="0"/>
+          <w:sz w:val="24"/>
+          <w:szCs w:val="24"/>
+          <w:lang w:val="en-US"/>
+        </w:rPr>
+        <w:t xml:space="preserve"> </w:t>
+      </w:r>
+    </w:p>
+    <w:p xmlns:wp14="http://schemas.microsoft.com/office/word/2010/wordml" wp14:paraId="33F0B8B6" wp14:textId="11FC23B2">
+      <w:pPr>
+        <w:pStyle w:val="Normal"/>
+        <w:spacing w:before="0" w:beforeAutospacing="off" w:after="0" w:afterAutospacing="off"/>
+      </w:pPr>
+      <w:r>
+        <w:rPr>
+          <w:rFonts w:ascii="Calibri" w:hAnsi="Calibri" w:eastAsia="Calibri" w:cs="Calibri"/>
+          <w:noProof w:val="0"/>
+          <w:sz w:val="24"/>
+          <w:szCs w:val="24"/>
+          <w:lang w:val="en-US"/>
+        </w:rPr>
+        <w:t xml:space="preserve">  CONSTRAINT fk_budget_category</w:t>
+      </w:r>
+    </w:p>
+    <w:p xmlns:wp14="http://schemas.microsoft.com/office/word/2010/wordml" wp14:paraId="4BCCA4C6" wp14:textId="2CBE0CDD">
+      <w:pPr>
+        <w:pStyle w:val="Normal"/>
+        <w:spacing w:before="0" w:beforeAutospacing="off" w:after="0" w:afterAutospacing="off"/>
+      </w:pPr>
+      <w:r>
+        <w:rPr>
+          <w:rFonts w:ascii="Calibri" w:hAnsi="Calibri" w:eastAsia="Calibri" w:cs="Calibri"/>
+          <w:noProof w:val="0"/>
+          <w:sz w:val="24"/>
+          <w:szCs w:val="24"/>
+          <w:lang w:val="en-US"/>
+        </w:rPr>
+        <w:t xml:space="preserve">    FOREIGN KEY (category_id)</w:t>
+      </w:r>
+    </w:p>
+    <w:p xmlns:wp14="http://schemas.microsoft.com/office/word/2010/wordml" wp14:paraId="577BAA3F" wp14:textId="7A2E993F">
+      <w:pPr>
+        <w:pStyle w:val="Normal"/>
+        <w:spacing w:before="0" w:beforeAutospacing="off" w:after="0" w:afterAutospacing="off"/>
+      </w:pPr>
+      <w:r>
+        <w:rPr>
+          <w:rFonts w:ascii="Calibri" w:hAnsi="Calibri" w:eastAsia="Calibri" w:cs="Calibri"/>
+          <w:noProof w:val="0"/>
+          <w:sz w:val="24"/>
+          <w:szCs w:val="24"/>
+          <w:lang w:val="en-US"/>
+        </w:rPr>
+        <w:t xml:space="preserve">    REFERENCES categories(id)</w:t>
+      </w:r>
+    </w:p>
+    <w:p xmlns:wp14="http://schemas.microsoft.com/office/word/2010/wordml" wp14:paraId="180804D6" wp14:textId="689A717C">
+      <w:pPr>
+        <w:pStyle w:val="Normal"/>
+        <w:spacing w:before="0" w:beforeAutospacing="off" w:after="0" w:afterAutospacing="off"/>
+      </w:pPr>
+      <w:r>
+        <w:rPr>
+          <w:rFonts w:ascii="Calibri" w:hAnsi="Calibri" w:eastAsia="Calibri" w:cs="Calibri"/>
+          <w:noProof w:val="0"/>
+          <w:sz w:val="24"/>
+          <w:szCs w:val="24"/>
+          <w:lang w:val="en-US"/>
+        </w:rPr>
+        <w:t xml:space="preserve">    ON DELETE CASCADE</w:t>
+      </w:r>
+    </w:p>
+    <w:p xmlns:wp14="http://schemas.microsoft.com/office/word/2010/wordml" wp14:paraId="57425121" wp14:textId="32A9E0D0">
+      <w:pPr>
+        <w:pStyle w:val="Normal"/>
+        <w:spacing w:before="0" w:beforeAutospacing="off" w:after="0" w:afterAutospacing="off"/>
+      </w:pPr>
+      <w:r>
+        <w:rPr>
+          <w:rFonts w:ascii="Calibri" w:hAnsi="Calibri" w:eastAsia="Calibri" w:cs="Calibri"/>
+          <w:noProof w:val="0"/>
+          <w:sz w:val="24"/>
+          <w:szCs w:val="24"/>
+          <w:lang w:val="en-US"/>
+        </w:rPr>
+        <w:t xml:space="preserve">    ON UPDATE CASCADE</w:t>
+      </w:r>
+    </w:p>
+    <w:p xmlns:wp14="http://schemas.microsoft.com/office/word/2010/wordml" wp14:paraId="2FECDAB7" wp14:textId="01EB162C">
+      <w:pPr>
+        <w:pStyle w:val="Normal"/>
+        <w:spacing w:before="0" w:beforeAutospacing="off" w:after="0" w:afterAutospacing="off"/>
+      </w:pPr>
+      <w:r>
+        <w:rPr>
+          <w:rFonts w:ascii="Calibri" w:hAnsi="Calibri" w:eastAsia="Calibri" w:cs="Calibri"/>
+          <w:noProof w:val="0"/>
+          <w:sz w:val="24"/>
+          <w:szCs w:val="24"/>
+          <w:lang w:val="en-US"/>
+        </w:rPr>
+        <w:t>);</w:t>
+      </w:r>
+    </w:p>
+    <w:p xmlns:wp14="http://schemas.microsoft.com/office/word/2010/wordml" wp14:paraId="29D04E2F" wp14:textId="42777C70">
+      <w:pPr>
+        <w:pStyle w:val="Heading3"/>
+        <w:suppressLineNumbers w:val="0"/>
+        <w:bidi w:val="0"/>
+        <w:spacing w:before="281" w:beforeAutospacing="off" w:after="281" w:afterAutospacing="off" w:line="279" w:lineRule="auto"/>
+        <w:ind w:left="0" w:right="0"/>
+        <w:jc w:val="left"/>
+      </w:pPr>
+      <w:r>
+        <w:rPr>
+          <w:rFonts w:ascii="Calibri" w:hAnsi="Calibri" w:eastAsia="Calibri" w:cs="Calibri"/>
+          <w:b w:val="1"/>
+          <w:bCs w:val="1"/>
+          <w:noProof w:val="0"/>
+          <w:sz w:val="28"/>
+          <w:szCs w:val="28"/>
+          <w:lang w:val="en-US"/>
+        </w:rPr>
+        <w:t>Categories Table</w:t>
+      </w:r>
+    </w:p>
+    <w:p xmlns:wp14="http://schemas.microsoft.com/office/word/2010/wordml" wp14:paraId="327270B8" wp14:textId="7FAF93B3">
+      <w:pPr>
+        <w:pStyle w:val="Normal"/>
+        <w:spacing w:before="0" w:beforeAutospacing="off" w:after="0" w:afterAutospacing="off"/>
+      </w:pPr>
+      <w:r>
+        <w:rPr>
+          <w:rFonts w:ascii="Calibri" w:hAnsi="Calibri" w:eastAsia="Calibri" w:cs="Calibri"/>
+          <w:noProof w:val="0"/>
+          <w:sz w:val="24"/>
+          <w:szCs w:val="24"/>
+          <w:lang w:val="en-US"/>
+        </w:rPr>
+        <w:t>CREATE TABLE categories (</w:t>
+      </w:r>
+    </w:p>
+    <w:p xmlns:wp14="http://schemas.microsoft.com/office/word/2010/wordml" wp14:paraId="73C22480" wp14:textId="7E6C9D39">
+      <w:pPr>
+        <w:pStyle w:val="Normal"/>
+        <w:spacing w:before="0" w:beforeAutospacing="off" w:after="0" w:afterAutospacing="off"/>
+      </w:pPr>
+      <w:r>
+        <w:rPr>
+          <w:rFonts w:ascii="Calibri" w:hAnsi="Calibri" w:eastAsia="Calibri" w:cs="Calibri"/>
+          <w:noProof w:val="0"/>
+          <w:sz w:val="24"/>
+          <w:szCs w:val="24"/>
+          <w:lang w:val="en-US"/>
+        </w:rPr>
+        <w:t xml:space="preserve">  id INT AUTO_INCREMENT PRIMARY KEY,</w:t>
+      </w:r>
+    </w:p>
+    <w:p xmlns:wp14="http://schemas.microsoft.com/office/word/2010/wordml" wp14:paraId="72DDC27F" wp14:textId="60E43611">
+      <w:pPr>
+        <w:pStyle w:val="Normal"/>
+        <w:spacing w:before="0" w:beforeAutospacing="off" w:after="0" w:afterAutospacing="off"/>
+      </w:pPr>
+      <w:r>
+        <w:rPr>
+          <w:rFonts w:ascii="Calibri" w:hAnsi="Calibri" w:eastAsia="Calibri" w:cs="Calibri"/>
+          <w:noProof w:val="0"/>
+          <w:sz w:val="24"/>
+          <w:szCs w:val="24"/>
+          <w:lang w:val="en-US"/>
+        </w:rPr>
+        <w:t xml:space="preserve">  name VARCHAR(50) NOT NULL UNIQUE</w:t>
+      </w:r>
+    </w:p>
+    <w:p xmlns:wp14="http://schemas.microsoft.com/office/word/2010/wordml" wp14:paraId="5BA4D8DE" wp14:textId="11388BC6">
       <w:pPr>
         <w:pStyle w:val="Normal"/>
         <w:spacing w:before="0" w:beforeAutospacing="off" w:after="0" w:afterAutospacing="off"/>
@@ -1998,7 +2317,7 @@
       </w:pPr>
       <w:r>
         <w:drawing>
-          <wp:inline wp14:editId="309C3AB4" wp14:anchorId="4E8D4F40">
+          <wp:inline wp14:editId="7D440B81" wp14:anchorId="4E8D4F40">
             <wp:extent cx="2743583" cy="4639322"/>
             <wp:effectExtent l="0" t="0" r="0" b="0"/>
             <wp:docPr id="1860427920" name="drawing"/>
@@ -2051,7 +2370,7 @@
       </w:pPr>
       <w:r>
         <w:drawing>
-          <wp:inline wp14:editId="34F43978" wp14:anchorId="39A608B6">
+          <wp:inline wp14:editId="6FDB0509" wp14:anchorId="39A608B6">
             <wp:extent cx="4906060" cy="3743847"/>
             <wp:effectExtent l="0" t="0" r="0" b="0"/>
             <wp:docPr id="1570990895" name="drawing"/>
@@ -4992,7 +5311,7 @@
     <w:next w:val="Normal"/>
     <w:unhideWhenUsed/>
     <w:qFormat/>
-    <w:rsid w:val="5C9290DF"/>
+    <w:rsid w:val="53D94C0F"/>
     <w:rPr>
       <w:rFonts w:ascii="Aptos Display" w:hAnsi="Aptos Display" w:eastAsia="" w:cs="" w:asciiTheme="majorAscii" w:hAnsiTheme="majorAscii" w:eastAsiaTheme="majorEastAsia" w:cstheme="majorBidi"/>
       <w:color w:val="0F4761" w:themeColor="accent1" w:themeTint="FF" w:themeShade="BF"/>
@@ -5013,7 +5332,7 @@
     <w:next w:val="Normal"/>
     <w:unhideWhenUsed/>
     <w:qFormat/>
-    <w:rsid w:val="5C9290DF"/>
+    <w:rsid w:val="53D94C0F"/>
     <w:rPr>
       <w:rFonts w:eastAsia="" w:cs="" w:eastAsiaTheme="majorEastAsia" w:cstheme="majorBidi"/>
       <w:color w:val="0F4761" w:themeColor="accent1" w:themeTint="FF" w:themeShade="BF"/>
@@ -5032,7 +5351,7 @@
     <w:name w:val="List Paragraph"/>
     <w:basedOn w:val="Normal"/>
     <w:qFormat/>
-    <w:rsid w:val="5C9290DF"/>
+    <w:rsid w:val="53D94C0F"/>
     <w:pPr>
       <w:spacing/>
       <w:ind w:left="720"/>

</xml_diff>